<commit_message>
Deployed a030d05 with MkDocs version: 1.6.1
</commit_message>
<xml_diff>
--- a/Premios/conformes-1.docx
+++ b/Premios/conformes-1.docx
@@ -1,6 +1,6 @@
 
 <file path=word/document.xml><?xml version="1.0" encoding="utf-8"?>
-<w:document xmlns:wpc="http://schemas.microsoft.com/office/word/2010/wordprocessingCanvas" xmlns:cx="http://schemas.microsoft.com/office/drawing/2014/chartex" xmlns:cx1="http://schemas.microsoft.com/office/drawing/2015/9/8/chartex" xmlns:cx2="http://schemas.microsoft.com/office/drawing/2015/10/21/chartex" xmlns:cx3="http://schemas.microsoft.com/office/drawing/2016/5/9/chartex" xmlns:cx4="http://schemas.microsoft.com/office/drawing/2016/5/10/chartex" xmlns:cx5="http://schemas.microsoft.com/office/drawing/2016/5/11/chartex" xmlns:cx6="http://schemas.microsoft.com/office/drawing/2016/5/12/chartex" xmlns:cx7="http://schemas.microsoft.com/office/drawing/2016/5/13/chartex" xmlns:cx8="http://schemas.microsoft.com/office/drawing/2016/5/14/chartex" xmlns:mc="http://schemas.openxmlformats.org/markup-compatibility/2006" xmlns:aink="http://schemas.microsoft.com/office/drawing/2016/ink" xmlns:am3d="http://schemas.microsoft.com/office/drawing/2017/model3d" xmlns:o="urn:schemas-microsoft-com:office:office" xmlns:oel="http://schemas.microsoft.com/office/2019/extlst" xmlns:r="http://schemas.openxmlformats.org/officeDocument/2006/relationships" xmlns:m="http://schemas.openxmlformats.org/officeDocument/2006/math" xmlns:v="urn:schemas-microsoft-com:vml" xmlns:wp14="http://schemas.microsoft.com/office/word/2010/wordprocessingDrawing" xmlns:wp="http://schemas.openxmlformats.org/drawingml/2006/wordprocessingDrawing" xmlns:w10="urn:schemas-microsoft-com:office:word" xmlns:w="http://schemas.openxmlformats.org/wordprocessingml/2006/main" xmlns:w14="http://schemas.microsoft.com/office/word/2010/wordml" xmlns:w15="http://schemas.microsoft.com/office/word/2012/wordml" xmlns:w16cex="http://schemas.microsoft.com/office/word/2018/wordml/cex" xmlns:w16cid="http://schemas.microsoft.com/office/word/2016/wordml/cid" xmlns:w16="http://schemas.microsoft.com/office/word/2018/wordml" xmlns:w16sdtdh="http://schemas.microsoft.com/office/word/2020/wordml/sdtdatahash" xmlns:w16se="http://schemas.microsoft.com/office/word/2015/wordml/symex" xmlns:wpg="http://schemas.microsoft.com/office/word/2010/wordprocessingGroup" xmlns:wpi="http://schemas.microsoft.com/office/word/2010/wordprocessingInk" xmlns:wne="http://schemas.microsoft.com/office/word/2006/wordml" xmlns:wps="http://schemas.microsoft.com/office/word/2010/wordprocessingShape" mc:Ignorable="w14 w15 w16se w16cid w16 w16cex w16sdtdh wp14">
+<w:document xmlns:wpc="http://schemas.microsoft.com/office/word/2010/wordprocessingCanvas" xmlns:cx="http://schemas.microsoft.com/office/drawing/2014/chartex" xmlns:cx1="http://schemas.microsoft.com/office/drawing/2015/9/8/chartex" xmlns:cx2="http://schemas.microsoft.com/office/drawing/2015/10/21/chartex" xmlns:cx3="http://schemas.microsoft.com/office/drawing/2016/5/9/chartex" xmlns:cx4="http://schemas.microsoft.com/office/drawing/2016/5/10/chartex" xmlns:cx5="http://schemas.microsoft.com/office/drawing/2016/5/11/chartex" xmlns:cx6="http://schemas.microsoft.com/office/drawing/2016/5/12/chartex" xmlns:cx7="http://schemas.microsoft.com/office/drawing/2016/5/13/chartex" xmlns:cx8="http://schemas.microsoft.com/office/drawing/2016/5/14/chartex" xmlns:mc="http://schemas.openxmlformats.org/markup-compatibility/2006" xmlns:aink="http://schemas.microsoft.com/office/drawing/2016/ink" xmlns:am3d="http://schemas.microsoft.com/office/drawing/2017/model3d" xmlns:o="urn:schemas-microsoft-com:office:office" xmlns:oel="http://schemas.microsoft.com/office/2019/extlst" xmlns:r="http://schemas.openxmlformats.org/officeDocument/2006/relationships" xmlns:m="http://schemas.openxmlformats.org/officeDocument/2006/math" xmlns:v="urn:schemas-microsoft-com:vml" xmlns:wp14="http://schemas.microsoft.com/office/word/2010/wordprocessingDrawing" xmlns:wp="http://schemas.openxmlformats.org/drawingml/2006/wordprocessingDrawing" xmlns:w10="urn:schemas-microsoft-com:office:word" xmlns:w="http://schemas.openxmlformats.org/wordprocessingml/2006/main" xmlns:w14="http://schemas.microsoft.com/office/word/2010/wordml" xmlns:w15="http://schemas.microsoft.com/office/word/2012/wordml" xmlns:w16cex="http://schemas.microsoft.com/office/word/2018/wordml/cex" xmlns:w16cid="http://schemas.microsoft.com/office/word/2016/wordml/cid" xmlns:w16="http://schemas.microsoft.com/office/word/2018/wordml" xmlns:w16du="http://schemas.microsoft.com/office/word/2023/wordml/word16du" xmlns:w16sdtdh="http://schemas.microsoft.com/office/word/2020/wordml/sdtdatahash" xmlns:w16sdtfl="http://schemas.microsoft.com/office/word/2024/wordml/sdtformatlock" xmlns:w16se="http://schemas.microsoft.com/office/word/2015/wordml/symex" xmlns:wpg="http://schemas.microsoft.com/office/word/2010/wordprocessingGroup" xmlns:wpi="http://schemas.microsoft.com/office/word/2010/wordprocessingInk" xmlns:wne="http://schemas.microsoft.com/office/word/2006/wordml" xmlns:wps="http://schemas.microsoft.com/office/word/2010/wordprocessingShape" mc:Ignorable="w14 w15 w16se w16cid w16 w16cex w16sdtdh w16sdtfl w16du wp14">
   <w:body>
     <w:p>
       <w:pPr>
@@ -121,7 +121,7 @@
     </w:p>
     <w:p>
       <w:pPr>
-        <w:pStyle w:val="Ttulo1"/>
+        <w:pStyle w:val="Heading1"/>
         <w:spacing w:line="361" w:lineRule="exact"/>
         <w:ind w:left="1201"/>
         <w:jc w:val="left"/>
@@ -194,7 +194,7 @@
     </w:p>
     <w:p>
       <w:pPr>
-        <w:pStyle w:val="Ttulo1"/>
+        <w:pStyle w:val="Heading1"/>
         <w:ind w:right="2074"/>
         <w:rPr>
           <w:w w:val="80"/>
@@ -213,7 +213,7 @@
     </w:p>
     <w:p>
       <w:pPr>
-        <w:pStyle w:val="Ttulo1"/>
+        <w:pStyle w:val="Heading1"/>
         <w:ind w:right="2074"/>
         <w:rPr>
           <w:w w:val="80"/>
@@ -232,7 +232,7 @@
     </w:p>
     <w:p>
       <w:pPr>
-        <w:pStyle w:val="Textoindependiente"/>
+        <w:pStyle w:val="BodyText"/>
         <w:spacing w:before="8"/>
         <w:rPr>
           <w:sz w:val="15"/>
@@ -241,7 +241,7 @@
     </w:p>
     <w:p>
       <w:pPr>
-        <w:pStyle w:val="Textoindependiente"/>
+        <w:pStyle w:val="BodyText"/>
         <w:spacing w:before="95"/>
         <w:ind w:left="208"/>
       </w:pPr>
@@ -380,7 +380,7 @@
     </w:p>
     <w:p>
       <w:pPr>
-        <w:pStyle w:val="Textoindependiente"/>
+        <w:pStyle w:val="BodyText"/>
         <w:ind w:left="208"/>
       </w:pPr>
       <w:r>
@@ -389,7 +389,7 @@
     </w:p>
     <w:p>
       <w:pPr>
-        <w:pStyle w:val="Textoindependiente"/>
+        <w:pStyle w:val="BodyText"/>
         <w:ind w:left="208"/>
       </w:pPr>
       <w:r>
@@ -398,62 +398,62 @@
     </w:p>
     <w:p>
       <w:pPr>
-        <w:pStyle w:val="Textoindependiente"/>
+        <w:pStyle w:val="BodyText"/>
         <w:spacing w:before="63"/>
         <w:ind w:left="208"/>
       </w:pPr>
       <w:r>
-        <w:pict w14:anchorId="65C19C0D">
+        <w:pict w14:anchorId="43D7D315">
           <v:shape id="_x0000_s1037" alt="" style="position:absolute;left:0;text-align:left;margin-left:41.5pt;margin-top:59.8pt;width:512.4pt;height:.5pt;z-index:-15833600;mso-wrap-edited:f;mso-width-percent:0;mso-height-percent:0;mso-position-horizontal-relative:page;mso-width-percent:0;mso-height-percent:0" coordsize="10248,10" path="m10248,l5928,r-9,l,,,10r5919,l5928,10r4320,l10248,xe" fillcolor="black" stroked="f">
-            <v:path arrowok="t" o:connecttype="custom" o:connectlocs="6507480,759460;3764280,759460;3758565,759460;0,759460;0,765810;3758565,765810;3764280,765810;6507480,765810;6507480,759460" o:connectangles="0,0,0,0,0,0,0,0,0"/>
+            <v:path arrowok="t" o:connecttype="custom" o:connectlocs="2147483646,482257100;2147483646,482257100;2147483646,482257100;0,482257100;0,486289350;2147483646,486289350;2147483646,486289350;2147483646,486289350;2147483646,482257100" o:connectangles="0,0,0,0,0,0,0,0,0"/>
             <w10:wrap anchorx="page"/>
           </v:shape>
         </w:pict>
       </w:r>
       <w:r>
-        <w:pict w14:anchorId="5F274DE0">
+        <w:pict w14:anchorId="2FC9ED92">
           <v:shape id="_x0000_s1036" alt="" style="position:absolute;left:0;text-align:left;margin-left:41.5pt;margin-top:143.8pt;width:512.4pt;height:.5pt;z-index:-15833088;mso-wrap-edited:f;mso-width-percent:0;mso-height-percent:0;mso-position-horizontal-relative:page;mso-width-percent:0;mso-height-percent:0" coordsize="10248,10" path="m10248,l5928,r-9,l,,,10r5919,l5928,10r4320,l10248,xe" fillcolor="black" stroked="f">
-            <v:path arrowok="t" o:connecttype="custom" o:connectlocs="6507480,1826260;3764280,1826260;3758565,1826260;0,1826260;0,1832610;3758565,1832610;3764280,1832610;6507480,1832610;6507480,1826260" o:connectangles="0,0,0,0,0,0,0,0,0"/>
+            <v:path arrowok="t" o:connecttype="custom" o:connectlocs="2147483646,1159675100;2147483646,1159675100;2147483646,1159675100;0,1159675100;0,1163707350;2147483646,1163707350;2147483646,1163707350;2147483646,1163707350;2147483646,1159675100" o:connectangles="0,0,0,0,0,0,0,0,0"/>
             <w10:wrap anchorx="page"/>
           </v:shape>
         </w:pict>
       </w:r>
       <w:r>
-        <w:pict w14:anchorId="0BB0A1D8">
+        <w:pict w14:anchorId="55A8B838">
           <v:shape id="_x0000_s1035" alt="" style="position:absolute;left:0;text-align:left;margin-left:41.5pt;margin-top:163pt;width:512.4pt;height:.5pt;z-index:-15832576;mso-wrap-edited:f;mso-width-percent:0;mso-height-percent:0;mso-position-horizontal-relative:page;mso-width-percent:0;mso-height-percent:0" coordsize="10248,10" path="m10248,l5928,r-9,l,,,10r5919,l5928,10r4320,l10248,xe" fillcolor="black" stroked="f">
-            <v:path arrowok="t" o:connecttype="custom" o:connectlocs="6507480,2070100;3764280,2070100;3758565,2070100;0,2070100;0,2076450;3758565,2076450;3764280,2076450;6507480,2076450;6507480,2070100" o:connectangles="0,0,0,0,0,0,0,0,0"/>
+            <v:path arrowok="t" o:connecttype="custom" o:connectlocs="2147483646,1314513500;2147483646,1314513500;2147483646,1314513500;0,1314513500;0,1318545750;2147483646,1318545750;2147483646,1318545750;2147483646,1318545750;2147483646,1314513500" o:connectangles="0,0,0,0,0,0,0,0,0"/>
             <w10:wrap anchorx="page"/>
           </v:shape>
         </w:pict>
       </w:r>
       <w:r>
-        <w:pict w14:anchorId="616AA281">
+        <w:pict w14:anchorId="5F0BC37C">
           <v:shape id="_x0000_s1034" alt="" style="position:absolute;left:0;text-align:left;margin-left:41.5pt;margin-top:205.95pt;width:512.4pt;height:2.2pt;z-index:-15832064;mso-wrap-edited:f;mso-width-percent:0;mso-height-percent:0;mso-position-horizontal-relative:page;mso-width-percent:0;mso-height-percent:0" coordsize="10248,44" path="m10248,l5962,r-43,l,,,44r5919,l5962,44r4286,l10248,xe" fillcolor="black" stroked="f">
-            <v:path arrowok="t" o:connecttype="custom" o:connectlocs="6507480,2615565;3785870,2615565;3758565,2615565;0,2615565;0,2643505;3758565,2643505;3785870,2643505;6507480,2643505;6507480,2615565" o:connectangles="0,0,0,0,0,0,0,0,0"/>
+            <v:path arrowok="t" o:connecttype="custom" o:connectlocs="2147483646,1660883775;2147483646,1660883775;2147483646,1660883775;0,1660883775;0,1678625675;2147483646,1678625675;2147483646,1678625675;2147483646,1678625675;2147483646,1660883775" o:connectangles="0,0,0,0,0,0,0,0,0"/>
             <w10:wrap anchorx="page"/>
           </v:shape>
         </w:pict>
       </w:r>
       <w:r>
-        <w:pict w14:anchorId="551A53D5">
+        <w:pict w14:anchorId="40848E72">
           <v:shape id="_x0000_s1033" alt="" style="position:absolute;left:0;text-align:left;margin-left:41.5pt;margin-top:226.85pt;width:512.4pt;height:.5pt;z-index:-15831552;mso-wrap-edited:f;mso-width-percent:0;mso-height-percent:0;mso-position-horizontal-relative:page;mso-width-percent:0;mso-height-percent:0" coordsize="10248,10" path="m10248,l5928,r-9,l,,,10r5919,l5928,10r4320,l10248,xe" fillcolor="black" stroked="f">
-            <v:path arrowok="t" o:connecttype="custom" o:connectlocs="6507480,2880995;3764280,2880995;3758565,2880995;0,2880995;0,2887345;3758565,2887345;3764280,2887345;6507480,2887345;6507480,2880995" o:connectangles="0,0,0,0,0,0,0,0,0"/>
+            <v:path arrowok="t" o:connecttype="custom" o:connectlocs="2147483646,1829431825;2147483646,1829431825;2147483646,1829431825;0,1829431825;0,1833464075;2147483646,1833464075;2147483646,1833464075;2147483646,1833464075;2147483646,1829431825" o:connectangles="0,0,0,0,0,0,0,0,0"/>
             <w10:wrap anchorx="page"/>
           </v:shape>
         </w:pict>
       </w:r>
       <w:r>
-        <w:pict w14:anchorId="4C7ABE2C">
+        <w:pict w14:anchorId="29F06505">
           <v:shape id="_x0000_s1032" alt="" style="position:absolute;left:0;text-align:left;margin-left:41.5pt;margin-top:246.05pt;width:512.4pt;height:.5pt;z-index:-15831040;mso-wrap-edited:f;mso-width-percent:0;mso-height-percent:0;mso-position-horizontal-relative:page;mso-width-percent:0;mso-height-percent:0" coordsize="10248,10" path="m10248,l5928,r-9,l,,,10r5919,l5928,10r4320,l10248,xe" fillcolor="black" stroked="f">
-            <v:path arrowok="t" o:connecttype="custom" o:connectlocs="6507480,3124835;3764280,3124835;3758565,3124835;0,3124835;0,3131185;3758565,3131185;3764280,3131185;6507480,3131185;6507480,3124835" o:connectangles="0,0,0,0,0,0,0,0,0"/>
+            <v:path arrowok="t" o:connecttype="custom" o:connectlocs="2147483646,1984270225;2147483646,1984270225;2147483646,1984270225;0,1984270225;0,1988302475;2147483646,1988302475;2147483646,1988302475;2147483646,1988302475;2147483646,1984270225" o:connectangles="0,0,0,0,0,0,0,0,0"/>
             <w10:wrap anchorx="page"/>
           </v:shape>
         </w:pict>
       </w:r>
       <w:r>
-        <w:pict w14:anchorId="412625A2">
+        <w:pict w14:anchorId="73762745">
           <v:shape id="_x0000_s1031" alt="" style="position:absolute;left:0;text-align:left;margin-left:41.5pt;margin-top:289pt;width:512.4pt;height:2.2pt;z-index:-15830528;mso-wrap-edited:f;mso-width-percent:0;mso-height-percent:0;mso-position-horizontal-relative:page;mso-width-percent:0;mso-height-percent:0" coordsize="10248,44" path="m10248,l5962,r-43,l,,,43r5919,l5962,43r4286,l10248,xe" fillcolor="black" stroked="f">
-            <v:path arrowok="t" o:connecttype="custom" o:connectlocs="6507480,3670300;3785870,3670300;3758565,3670300;0,3670300;0,3697605;3758565,3697605;3785870,3697605;6507480,3697605;6507480,3670300" o:connectangles="0,0,0,0,0,0,0,0,0"/>
+            <v:path arrowok="t" o:connecttype="custom" o:connectlocs="2147483646,2147483646;2147483646,2147483646;2147483646,2147483646;0,2147483646;0,2147483646;2147483646,2147483646;2147483646,2147483646;2147483646,2147483646;2147483646,2147483646" o:connectangles="0,0,0,0,0,0,0,0,0"/>
             <w10:wrap anchorx="page"/>
           </v:shape>
         </w:pict>
@@ -516,7 +516,7 @@
     </w:p>
     <w:p>
       <w:pPr>
-        <w:pStyle w:val="Textoindependiente"/>
+        <w:pStyle w:val="BodyText"/>
         <w:spacing w:before="6"/>
         <w:rPr>
           <w:sz w:val="10"/>
@@ -525,7 +525,7 @@
     </w:p>
     <w:tbl>
       <w:tblPr>
-        <w:tblStyle w:val="TableNormal"/>
+        <w:tblStyle w:val="TableNormal1"/>
         <w:tblW w:w="0" w:type="auto"/>
         <w:tblInd w:w="123" w:type="dxa"/>
         <w:tblLayout w:type="fixed"/>
@@ -2077,12 +2077,28 @@
               <w:pStyle w:val="TableParagraph"/>
               <w:spacing w:before="81"/>
               <w:ind w:left="144"/>
-            </w:pPr>
-            <w:r>
               <w:rPr>
                 <w:w w:val="90"/>
               </w:rPr>
+            </w:pPr>
+            <w:r>
+              <w:rPr>
+                <w:w w:val="90"/>
+              </w:rPr>
               <w:t>Nombre:</w:t>
+            </w:r>
+          </w:p>
+          <w:p>
+            <w:pPr>
+              <w:pStyle w:val="TableParagraph"/>
+              <w:spacing w:before="81"/>
+              <w:ind w:left="144"/>
+            </w:pPr>
+            <w:r>
+              <w:rPr>
+                <w:w w:val="90"/>
+              </w:rPr>
+              <w:t>Teléfono:</w:t>
             </w:r>
           </w:p>
         </w:tc>
@@ -2440,7 +2456,7 @@
           <w:p>
             <w:pPr>
               <w:pStyle w:val="TableParagraph"/>
-              <w:spacing w:before="80"/>
+              <w:spacing w:before="80" w:line="276" w:lineRule="auto"/>
               <w:ind w:left="144"/>
             </w:pPr>
             <w:r>
@@ -2453,19 +2469,12 @@
           <w:p>
             <w:pPr>
               <w:pStyle w:val="TableParagraph"/>
-              <w:rPr>
-                <w:sz w:val="24"/>
-              </w:rPr>
-            </w:pPr>
-          </w:p>
-          <w:p>
-            <w:pPr>
-              <w:pStyle w:val="TableParagraph"/>
-              <w:spacing w:before="9"/>
-              <w:rPr>
-                <w:sz w:val="20"/>
-              </w:rPr>
-            </w:pPr>
+              <w:spacing w:before="80" w:line="360" w:lineRule="auto"/>
+              <w:ind w:left="144"/>
+            </w:pPr>
+            <w:r>
+              <w:t>Teléfono:</w:t>
+            </w:r>
           </w:p>
           <w:p>
             <w:pPr>
@@ -2485,7 +2494,7 @@
     </w:tbl>
     <w:p>
       <w:pPr>
-        <w:pStyle w:val="Textoindependiente"/>
+        <w:pStyle w:val="BodyText"/>
         <w:spacing w:before="0"/>
         <w:rPr>
           <w:sz w:val="22"/>
@@ -2494,7 +2503,7 @@
     </w:p>
     <w:p>
       <w:pPr>
-        <w:pStyle w:val="Textoindependiente"/>
+        <w:pStyle w:val="BodyText"/>
         <w:spacing w:before="5"/>
         <w:rPr>
           <w:sz w:val="31"/>
@@ -2510,41 +2519,41 @@
         </w:rPr>
       </w:pPr>
       <w:r>
-        <w:pict w14:anchorId="672933A4">
+        <w:pict w14:anchorId="0197F62A">
           <v:shape id="_x0000_s1030" alt="" style="position:absolute;left:0;text-align:left;margin-left:41.5pt;margin-top:-280.35pt;width:512.4pt;height:.5pt;z-index:-15830016;mso-wrap-edited:f;mso-width-percent:0;mso-height-percent:0;mso-position-horizontal-relative:page;mso-width-percent:0;mso-height-percent:0" coordsize="10248,10" path="m10248,l5928,r-9,l,,,9r5919,l5928,9r4320,l10248,xe" fillcolor="black" stroked="f">
-            <v:path arrowok="t" o:connecttype="custom" o:connectlocs="6507480,-3560445;3764280,-3560445;3758565,-3560445;0,-3560445;0,-3554730;3758565,-3554730;3764280,-3554730;6507480,-3554730;6507480,-3560445" o:connectangles="0,0,0,0,0,0,0,0,0"/>
+            <v:path arrowok="t" o:connecttype="custom" o:connectlocs="2147483646,@1;2147483646,@1;2147483646,@1;0,@1;0,@1;2147483646,@1;2147483646,@1;2147483646,@1;2147483646,@1" o:connectangles="0,0,0,0,0,0,0,0,0"/>
             <w10:wrap anchorx="page"/>
           </v:shape>
         </w:pict>
       </w:r>
       <w:r>
-        <w:pict w14:anchorId="004D573B">
+        <w:pict w14:anchorId="7D41BC38">
           <v:shape id="_x0000_s1029" alt="" style="position:absolute;left:0;text-align:left;margin-left:41.5pt;margin-top:-261.15pt;width:512.4pt;height:.5pt;z-index:-15829504;mso-wrap-edited:f;mso-width-percent:0;mso-height-percent:0;mso-position-horizontal-relative:page;mso-width-percent:0;mso-height-percent:0" coordsize="10248,10" path="m10248,l5928,r-9,l,,,9r5919,l5928,9r4320,l10248,xe" fillcolor="black" stroked="f">
-            <v:path arrowok="t" o:connecttype="custom" o:connectlocs="6507480,-3316605;3764280,-3316605;3758565,-3316605;0,-3316605;0,-3310890;3758565,-3310890;3764280,-3310890;6507480,-3310890;6507480,-3316605" o:connectangles="0,0,0,0,0,0,0,0,0"/>
+            <v:path arrowok="t" o:connecttype="custom" o:connectlocs="2147483646,-2106044175;2147483646,-2106044175;2147483646,-2106044175;0,-2106044175;0,-2102415150;2147483646,-2102415150;2147483646,-2102415150;2147483646,-2102415150;2147483646,-2106044175" o:connectangles="0,0,0,0,0,0,0,0,0"/>
             <w10:wrap anchorx="page"/>
           </v:shape>
         </w:pict>
       </w:r>
       <w:r>
-        <w:pict w14:anchorId="655BD755">
+        <w:pict w14:anchorId="064B2562">
           <v:shape id="_x0000_s1028" alt="" style="position:absolute;left:0;text-align:left;margin-left:41.5pt;margin-top:-178.85pt;width:512.4pt;height:.5pt;z-index:-15828992;mso-wrap-edited:f;mso-width-percent:0;mso-height-percent:0;mso-position-horizontal-relative:page;mso-width-percent:0;mso-height-percent:0" coordsize="10248,10" path="m10248,l5928,r-9,l,,,10r5919,l5928,10r4320,l10248,xe" fillcolor="black" stroked="f">
-            <v:path arrowok="t" o:connecttype="custom" o:connectlocs="6507480,-2271395;3764280,-2271395;3758565,-2271395;0,-2271395;0,-2265045;3758565,-2265045;3764280,-2265045;6507480,-2265045;6507480,-2271395" o:connectangles="0,0,0,0,0,0,0,0,0"/>
+            <v:path arrowok="t" o:connecttype="custom" o:connectlocs="2147483646,-1442335825;2147483646,-1442335825;2147483646,-1442335825;0,-1442335825;0,-1438303575;2147483646,-1438303575;2147483646,-1438303575;2147483646,-1438303575;2147483646,-1442335825" o:connectangles="0,0,0,0,0,0,0,0,0"/>
             <w10:wrap anchorx="page"/>
           </v:shape>
         </w:pict>
       </w:r>
       <w:r>
-        <w:pict w14:anchorId="0C242ACB">
+        <w:pict w14:anchorId="51F43D35">
           <v:shape id="_x0000_s1027" alt="" style="position:absolute;left:0;text-align:left;margin-left:41.5pt;margin-top:-93.4pt;width:512.4pt;height:.5pt;z-index:-15828480;mso-wrap-edited:f;mso-width-percent:0;mso-height-percent:0;mso-position-horizontal-relative:page;mso-width-percent:0;mso-height-percent:0" coordsize="10248,10" path="m10248,l5928,r-9,l,,,10r5919,l5928,10r4320,l10248,xe" fillcolor="black" stroked="f">
-            <v:path arrowok="t" o:connecttype="custom" o:connectlocs="6507480,-1186180;3764280,-1186180;3758565,-1186180;0,-1186180;0,-1179830;3758565,-1179830;3764280,-1179830;6507480,-1179830;6507480,-1186180" o:connectangles="0,0,0,0,0,0,0,0,0"/>
+            <v:path arrowok="t" o:connecttype="custom" o:connectlocs="2147483646,-753224300;2147483646,-753224300;2147483646,-753224300;0,-753224300;0,-749192050;2147483646,-749192050;2147483646,-749192050;2147483646,-749192050;2147483646,-753224300" o:connectangles="0,0,0,0,0,0,0,0,0"/>
             <w10:wrap anchorx="page"/>
           </v:shape>
         </w:pict>
       </w:r>
       <w:r>
-        <w:pict w14:anchorId="7410BEBC">
+        <w:pict w14:anchorId="70913E55">
           <v:shape id="_x0000_s1026" alt="" style="position:absolute;left:0;text-align:left;margin-left:41.5pt;margin-top:-74.2pt;width:512.4pt;height:.5pt;z-index:-15827968;mso-wrap-edited:f;mso-width-percent:0;mso-height-percent:0;mso-position-horizontal-relative:page;mso-width-percent:0;mso-height-percent:0" coordsize="10248,10" path="m10248,l5928,r-9,l,,,10r5919,l5928,10r4320,l10248,xe" fillcolor="black" stroked="f">
-            <v:path arrowok="t" o:connecttype="custom" o:connectlocs="6507480,-942340;3764280,-942340;3758565,-942340;0,-942340;0,-935990;3758565,-935990;3764280,-935990;6507480,-935990;6507480,-942340" o:connectangles="0,0,0,0,0,0,0,0,0"/>
+            <v:path arrowok="t" o:connecttype="custom" o:connectlocs="2147483646,-598385900;2147483646,-598385900;2147483646,-598385900;0,-598385900;0,-594353650;2147483646,-594353650;2147483646,-594353650;2147483646,-594353650;2147483646,-598385900" o:connectangles="0,0,0,0,0,0,0,0,0"/>
             <w10:wrap anchorx="page"/>
           </v:shape>
         </w:pict>
@@ -2644,7 +2653,7 @@
 </file>
 
 <file path=word/styles.xml><?xml version="1.0" encoding="utf-8"?>
-<w:styles xmlns:mc="http://schemas.openxmlformats.org/markup-compatibility/2006" xmlns:r="http://schemas.openxmlformats.org/officeDocument/2006/relationships" xmlns:w="http://schemas.openxmlformats.org/wordprocessingml/2006/main" xmlns:w14="http://schemas.microsoft.com/office/word/2010/wordml" xmlns:w15="http://schemas.microsoft.com/office/word/2012/wordml" xmlns:w16cex="http://schemas.microsoft.com/office/word/2018/wordml/cex" xmlns:w16cid="http://schemas.microsoft.com/office/word/2016/wordml/cid" xmlns:w16="http://schemas.microsoft.com/office/word/2018/wordml" xmlns:w16sdtdh="http://schemas.microsoft.com/office/word/2020/wordml/sdtdatahash" xmlns:w16se="http://schemas.microsoft.com/office/word/2015/wordml/symex" mc:Ignorable="w14 w15 w16se w16cid w16 w16cex w16sdtdh">
+<w:styles xmlns:mc="http://schemas.openxmlformats.org/markup-compatibility/2006" xmlns:r="http://schemas.openxmlformats.org/officeDocument/2006/relationships" xmlns:w="http://schemas.openxmlformats.org/wordprocessingml/2006/main" xmlns:w14="http://schemas.microsoft.com/office/word/2010/wordml" xmlns:w15="http://schemas.microsoft.com/office/word/2012/wordml" xmlns:w16cex="http://schemas.microsoft.com/office/word/2018/wordml/cex" xmlns:w16cid="http://schemas.microsoft.com/office/word/2016/wordml/cid" xmlns:w16="http://schemas.microsoft.com/office/word/2018/wordml" xmlns:w16du="http://schemas.microsoft.com/office/word/2023/wordml/word16du" xmlns:w16sdtdh="http://schemas.microsoft.com/office/word/2020/wordml/sdtdatahash" xmlns:w16sdtfl="http://schemas.microsoft.com/office/word/2024/wordml/sdtformatlock" xmlns:w16se="http://schemas.microsoft.com/office/word/2015/wordml/symex" mc:Ignorable="w14 w15 w16se w16cid w16 w16cex w16sdtdh w16sdtfl w16du">
   <w:docDefaults>
     <w:rPrDefault>
       <w:rPr>
@@ -3048,7 +3057,7 @@
       <w:lang w:val="es-ES"/>
     </w:rPr>
   </w:style>
-  <w:style w:type="paragraph" w:styleId="Ttulo1">
+  <w:style w:type="paragraph" w:styleId="Heading1">
     <w:name w:val="heading 1"/>
     <w:basedOn w:val="Normal"/>
     <w:uiPriority w:val="9"/>
@@ -3063,13 +3072,13 @@
       <w:szCs w:val="32"/>
     </w:rPr>
   </w:style>
-  <w:style w:type="character" w:default="1" w:styleId="Fuentedeprrafopredeter">
+  <w:style w:type="character" w:default="1" w:styleId="DefaultParagraphFont">
     <w:name w:val="Default Paragraph Font"/>
     <w:uiPriority w:val="1"/>
     <w:semiHidden/>
     <w:unhideWhenUsed/>
   </w:style>
-  <w:style w:type="table" w:default="1" w:styleId="Tablanormal">
+  <w:style w:type="table" w:default="1" w:styleId="TableNormal">
     <w:name w:val="Normal Table"/>
     <w:uiPriority w:val="99"/>
     <w:semiHidden/>
@@ -3084,14 +3093,14 @@
       </w:tblCellMar>
     </w:tblPr>
   </w:style>
-  <w:style w:type="numbering" w:default="1" w:styleId="Sinlista">
+  <w:style w:type="numbering" w:default="1" w:styleId="NoList">
     <w:name w:val="No List"/>
     <w:uiPriority w:val="99"/>
     <w:semiHidden/>
     <w:unhideWhenUsed/>
   </w:style>
-  <w:style w:type="table" w:customStyle="1" w:styleId="TableNormal">
-    <w:name w:val="Table Normal"/>
+  <w:style w:type="table" w:customStyle="1" w:styleId="TableNormal1">
+    <w:name w:val="Table Normal1"/>
     <w:uiPriority w:val="2"/>
     <w:semiHidden/>
     <w:unhideWhenUsed/>
@@ -3106,7 +3115,7 @@
       </w:tblCellMar>
     </w:tblPr>
   </w:style>
-  <w:style w:type="paragraph" w:styleId="Textoindependiente">
+  <w:style w:type="paragraph" w:styleId="BodyText">
     <w:name w:val="Body Text"/>
     <w:basedOn w:val="Normal"/>
     <w:uiPriority w:val="1"/>
@@ -3119,7 +3128,7 @@
       <w:szCs w:val="20"/>
     </w:rPr>
   </w:style>
-  <w:style w:type="paragraph" w:styleId="Prrafodelista">
+  <w:style w:type="paragraph" w:styleId="ListParagraph">
     <w:name w:val="List Paragraph"/>
     <w:basedOn w:val="Normal"/>
     <w:uiPriority w:val="1"/>

</xml_diff>